<commit_message>
updated as of 26-Dec-2025
</commit_message>
<xml_diff>
--- a/Jenkins/Jenkins-01.docx
+++ b/Jenkins/Jenkins-01.docx
@@ -59,10 +59,7 @@
     </w:p>
     <w:p>
       <w:r>
-        <w:t>Worked on pre-requisite, as I</w:t>
-      </w:r>
-      <w:r>
-        <w:t xml:space="preserve"> watched </w:t>
+        <w:t xml:space="preserve">Worked on pre-requisite, as I watched </w:t>
       </w:r>
       <w:r>
         <w:rPr>
@@ -72,10 +69,7 @@
         <w:t>Jenkins-01</w:t>
       </w:r>
       <w:r>
-        <w:t xml:space="preserve"> video</w:t>
-      </w:r>
-      <w:r>
-        <w:t xml:space="preserve"> posted in DevOps group in slack as a requirement to work on </w:t>
+        <w:t xml:space="preserve"> video posted in DevOps group in slack as a requirement to work on </w:t>
       </w:r>
       <w:r>
         <w:t xml:space="preserve">Objectives, Prerequisites and </w:t>
@@ -346,6 +340,7 @@
         <w:rPr>
           <w:b/>
           <w:bCs/>
+          <w:noProof/>
           <w:lang w:val="en-US"/>
         </w:rPr>
         <w:drawing>
@@ -581,16 +576,14 @@
         <w:rPr>
           <w:lang w:val="en-US"/>
         </w:rPr>
-        <w:t xml:space="preserve">Nexus is </w:t>
-      </w:r>
-      <w:proofErr w:type="gramStart"/>
-      <w:r>
-        <w:rPr>
-          <w:lang w:val="en-US"/>
-        </w:rPr>
-        <w:t>a</w:t>
-      </w:r>
-      <w:proofErr w:type="gramEnd"/>
+        <w:t>Nexus is a</w:t>
+      </w:r>
+      <w:r>
+        <w:rPr>
+          <w:lang w:val="en-US"/>
+        </w:rPr>
+        <w:t>n</w:t>
+      </w:r>
       <w:r>
         <w:rPr>
           <w:lang w:val="en-US"/>
@@ -621,6 +614,402 @@
           <w:lang w:val="en-US"/>
         </w:rPr>
         <w:t xml:space="preserve"> and deployment will happen automatically without any manual intervention. </w:t>
+      </w:r>
+    </w:p>
+    <w:p>
+      <w:pPr>
+        <w:rPr>
+          <w:b/>
+          <w:bCs/>
+          <w:lang w:val="en-US"/>
+        </w:rPr>
+      </w:pPr>
+      <w:r>
+        <w:rPr>
+          <w:b/>
+          <w:bCs/>
+          <w:lang w:val="en-US"/>
+        </w:rPr>
+        <w:t xml:space="preserve">Simple </w:t>
+      </w:r>
+      <w:r>
+        <w:rPr>
+          <w:b/>
+          <w:bCs/>
+          <w:lang w:val="en-US"/>
+        </w:rPr>
+        <w:t>flow of Nexus:</w:t>
+      </w:r>
+    </w:p>
+    <w:p>
+      <w:pPr>
+        <w:pStyle w:val="ListParagraph"/>
+        <w:numPr>
+          <w:ilvl w:val="0"/>
+          <w:numId w:val="20"/>
+        </w:numPr>
+        <w:rPr>
+          <w:lang w:val="en-US"/>
+        </w:rPr>
+      </w:pPr>
+      <w:r>
+        <w:rPr>
+          <w:lang w:val="en-US"/>
+        </w:rPr>
+        <w:t>Developer commits code</w:t>
+      </w:r>
+    </w:p>
+    <w:p>
+      <w:pPr>
+        <w:pStyle w:val="ListParagraph"/>
+        <w:numPr>
+          <w:ilvl w:val="0"/>
+          <w:numId w:val="20"/>
+        </w:numPr>
+        <w:rPr>
+          <w:lang w:val="en-US"/>
+        </w:rPr>
+      </w:pPr>
+      <w:r>
+        <w:rPr>
+          <w:lang w:val="en-US"/>
+        </w:rPr>
+        <w:t>Jenkins builds application</w:t>
+      </w:r>
+    </w:p>
+    <w:p>
+      <w:pPr>
+        <w:pStyle w:val="ListParagraph"/>
+        <w:numPr>
+          <w:ilvl w:val="0"/>
+          <w:numId w:val="20"/>
+        </w:numPr>
+        <w:rPr>
+          <w:lang w:val="en-US"/>
+        </w:rPr>
+      </w:pPr>
+      <w:r>
+        <w:rPr>
+          <w:lang w:val="en-US"/>
+        </w:rPr>
+        <w:t>Builds artifact (JAR,</w:t>
+      </w:r>
+      <w:r>
+        <w:rPr>
+          <w:lang w:val="en-US"/>
+        </w:rPr>
+        <w:t xml:space="preserve"> </w:t>
+      </w:r>
+      <w:r>
+        <w:rPr>
+          <w:lang w:val="en-US"/>
+        </w:rPr>
+        <w:t xml:space="preserve">WAR, </w:t>
+      </w:r>
+      <w:r>
+        <w:rPr>
+          <w:lang w:val="en-US"/>
+        </w:rPr>
+        <w:t>Docker image) pushed to Nexus</w:t>
+      </w:r>
+    </w:p>
+    <w:p>
+      <w:pPr>
+        <w:pStyle w:val="ListParagraph"/>
+        <w:numPr>
+          <w:ilvl w:val="0"/>
+          <w:numId w:val="20"/>
+        </w:numPr>
+        <w:rPr>
+          <w:lang w:val="en-US"/>
+        </w:rPr>
+      </w:pPr>
+      <w:r>
+        <w:rPr>
+          <w:lang w:val="en-US"/>
+        </w:rPr>
+        <w:t>Other environments (QA, UAT, PROD) pull the same artif</w:t>
+      </w:r>
+      <w:r>
+        <w:rPr>
+          <w:lang w:val="en-US"/>
+        </w:rPr>
+        <w:t xml:space="preserve">act from Nexus. </w:t>
+      </w:r>
+    </w:p>
+    <w:p>
+      <w:pPr>
+        <w:pStyle w:val="ListParagraph"/>
+        <w:numPr>
+          <w:ilvl w:val="0"/>
+          <w:numId w:val="20"/>
+        </w:numPr>
+        <w:rPr>
+          <w:lang w:val="en-US"/>
+        </w:rPr>
+      </w:pPr>
+      <w:r>
+        <w:rPr>
+          <w:lang w:val="en-US"/>
+        </w:rPr>
+        <w:t xml:space="preserve">Build once and deploy many times. </w:t>
+      </w:r>
+      <w:r>
+        <w:rPr>
+          <w:lang w:val="en-US"/>
+        </w:rPr>
+        <w:t xml:space="preserve"> </w:t>
+      </w:r>
+    </w:p>
+    <w:p>
+      <w:pPr>
+        <w:rPr>
+          <w:b/>
+          <w:bCs/>
+          <w:lang w:val="en-US"/>
+        </w:rPr>
+      </w:pPr>
+      <w:r>
+        <w:rPr>
+          <w:b/>
+          <w:bCs/>
+          <w:lang w:val="en-US"/>
+        </w:rPr>
+        <w:t>Why do we need Nexus?</w:t>
+      </w:r>
+    </w:p>
+    <w:p>
+      <w:pPr>
+        <w:rPr>
+          <w:lang w:val="en-US"/>
+        </w:rPr>
+      </w:pPr>
+      <w:r>
+        <w:rPr>
+          <w:lang w:val="en-US"/>
+        </w:rPr>
+        <w:t>There are certain advantages and disadvantages</w:t>
+      </w:r>
+      <w:r>
+        <w:rPr>
+          <w:lang w:val="en-US"/>
+        </w:rPr>
+        <w:t>:</w:t>
+      </w:r>
+    </w:p>
+    <w:p>
+      <w:pPr>
+        <w:rPr>
+          <w:b/>
+          <w:bCs/>
+          <w:lang w:val="en-US"/>
+        </w:rPr>
+      </w:pPr>
+      <w:r>
+        <w:rPr>
+          <w:b/>
+          <w:bCs/>
+          <w:lang w:val="en-US"/>
+        </w:rPr>
+        <w:t>Advantages:</w:t>
+      </w:r>
+    </w:p>
+    <w:p>
+      <w:pPr>
+        <w:pStyle w:val="ListParagraph"/>
+        <w:numPr>
+          <w:ilvl w:val="0"/>
+          <w:numId w:val="21"/>
+        </w:numPr>
+        <w:rPr>
+          <w:lang w:val="en-US"/>
+        </w:rPr>
+      </w:pPr>
+      <w:r>
+        <w:rPr>
+          <w:lang w:val="en-US"/>
+        </w:rPr>
+        <w:t>Central Artifact Management</w:t>
+      </w:r>
+    </w:p>
+    <w:p>
+      <w:pPr>
+        <w:pStyle w:val="ListParagraph"/>
+        <w:numPr>
+          <w:ilvl w:val="0"/>
+          <w:numId w:val="21"/>
+        </w:numPr>
+        <w:rPr>
+          <w:lang w:val="en-US"/>
+        </w:rPr>
+      </w:pPr>
+      <w:r>
+        <w:rPr>
+          <w:lang w:val="en-US"/>
+        </w:rPr>
+        <w:lastRenderedPageBreak/>
+        <w:t>Faster Builds</w:t>
+      </w:r>
+    </w:p>
+    <w:p>
+      <w:pPr>
+        <w:pStyle w:val="ListParagraph"/>
+        <w:numPr>
+          <w:ilvl w:val="0"/>
+          <w:numId w:val="21"/>
+        </w:numPr>
+        <w:rPr>
+          <w:lang w:val="en-US"/>
+        </w:rPr>
+      </w:pPr>
+      <w:r>
+        <w:rPr>
+          <w:lang w:val="en-US"/>
+        </w:rPr>
+        <w:t>Supports multiple package types</w:t>
+      </w:r>
+    </w:p>
+    <w:p>
+      <w:pPr>
+        <w:pStyle w:val="ListParagraph"/>
+        <w:numPr>
+          <w:ilvl w:val="0"/>
+          <w:numId w:val="21"/>
+        </w:numPr>
+        <w:rPr>
+          <w:lang w:val="en-US"/>
+        </w:rPr>
+      </w:pPr>
+      <w:r>
+        <w:rPr>
+          <w:lang w:val="en-US"/>
+        </w:rPr>
+        <w:t>Better security</w:t>
+      </w:r>
+    </w:p>
+    <w:p>
+      <w:pPr>
+        <w:pStyle w:val="ListParagraph"/>
+        <w:numPr>
+          <w:ilvl w:val="0"/>
+          <w:numId w:val="21"/>
+        </w:numPr>
+        <w:rPr>
+          <w:lang w:val="en-US"/>
+        </w:rPr>
+      </w:pPr>
+      <w:r>
+        <w:rPr>
+          <w:lang w:val="en-US"/>
+        </w:rPr>
+        <w:t>CI/CD friendly</w:t>
+      </w:r>
+    </w:p>
+    <w:p>
+      <w:pPr>
+        <w:pStyle w:val="ListParagraph"/>
+        <w:numPr>
+          <w:ilvl w:val="0"/>
+          <w:numId w:val="21"/>
+        </w:numPr>
+        <w:rPr>
+          <w:lang w:val="en-US"/>
+        </w:rPr>
+      </w:pPr>
+      <w:r>
+        <w:rPr>
+          <w:lang w:val="en-US"/>
+        </w:rPr>
+        <w:t>Version Control</w:t>
+      </w:r>
+    </w:p>
+    <w:p>
+      <w:pPr>
+        <w:rPr>
+          <w:b/>
+          <w:bCs/>
+          <w:lang w:val="en-US"/>
+        </w:rPr>
+      </w:pPr>
+      <w:r>
+        <w:rPr>
+          <w:b/>
+          <w:bCs/>
+          <w:lang w:val="en-US"/>
+        </w:rPr>
+        <w:t>Disadvantages:</w:t>
+      </w:r>
+    </w:p>
+    <w:p>
+      <w:pPr>
+        <w:pStyle w:val="ListParagraph"/>
+        <w:numPr>
+          <w:ilvl w:val="0"/>
+          <w:numId w:val="22"/>
+        </w:numPr>
+        <w:rPr>
+          <w:lang w:val="en-US"/>
+        </w:rPr>
+      </w:pPr>
+      <w:r>
+        <w:rPr>
+          <w:lang w:val="en-US"/>
+        </w:rPr>
+        <w:t>Infrastructure Overhead</w:t>
+      </w:r>
+    </w:p>
+    <w:p>
+      <w:pPr>
+        <w:pStyle w:val="ListParagraph"/>
+        <w:numPr>
+          <w:ilvl w:val="0"/>
+          <w:numId w:val="22"/>
+        </w:numPr>
+        <w:rPr>
+          <w:lang w:val="en-US"/>
+        </w:rPr>
+      </w:pPr>
+      <w:r>
+        <w:rPr>
+          <w:lang w:val="en-US"/>
+        </w:rPr>
+        <w:t>Performance issues if poorly Managed</w:t>
+      </w:r>
+    </w:p>
+    <w:p>
+      <w:pPr>
+        <w:pStyle w:val="ListParagraph"/>
+        <w:numPr>
+          <w:ilvl w:val="0"/>
+          <w:numId w:val="22"/>
+        </w:numPr>
+        <w:rPr>
+          <w:lang w:val="en-US"/>
+        </w:rPr>
+      </w:pPr>
+      <w:r>
+        <w:rPr>
+          <w:lang w:val="en-US"/>
+        </w:rPr>
+        <w:t>Licensing cost</w:t>
+      </w:r>
+    </w:p>
+    <w:p>
+      <w:pPr>
+        <w:pStyle w:val="ListParagraph"/>
+        <w:numPr>
+          <w:ilvl w:val="0"/>
+          <w:numId w:val="22"/>
+        </w:numPr>
+        <w:rPr>
+          <w:lang w:val="en-US"/>
+        </w:rPr>
+      </w:pPr>
+      <w:r>
+        <w:rPr>
+          <w:lang w:val="en-US"/>
+        </w:rPr>
+        <w:t>Single point of failure.</w:t>
       </w:r>
     </w:p>
     <w:p>
@@ -850,7 +1239,6 @@
           <w:bCs/>
           <w:lang w:val="en-US"/>
         </w:rPr>
-        <w:lastRenderedPageBreak/>
         <w:t xml:space="preserve">Different components in Jenkins below. </w:t>
       </w:r>
     </w:p>
@@ -923,21 +1311,7 @@
         <w:rPr>
           <w:lang w:val="en-US"/>
         </w:rPr>
-        <w:t>Number of executors depends upon ec2 instance type. If the ec2 instance type is t</w:t>
-      </w:r>
-      <w:proofErr w:type="gramStart"/>
-      <w:r>
-        <w:rPr>
-          <w:lang w:val="en-US"/>
-        </w:rPr>
-        <w:t>2.micro</w:t>
-      </w:r>
-      <w:proofErr w:type="gramEnd"/>
-      <w:r>
-        <w:rPr>
-          <w:lang w:val="en-US"/>
-        </w:rPr>
-        <w:t xml:space="preserve"> and if we have 10 exec</w:t>
+        <w:t>Number of executors depends upon ec2 instance type. If the ec2 instance type is t2.micro and if we have 10 exec</w:t>
       </w:r>
       <w:r>
         <w:rPr>
@@ -1035,6 +1409,7 @@
           <w:bCs/>
           <w:lang w:val="en-US"/>
         </w:rPr>
+        <w:lastRenderedPageBreak/>
         <w:t>Plugin based jobs</w:t>
       </w:r>
       <w:r>
@@ -1352,7 +1727,6 @@
           <w:szCs w:val="32"/>
           <w:lang w:val="en-US"/>
         </w:rPr>
-        <w:lastRenderedPageBreak/>
         <w:t>Task</w:t>
       </w:r>
       <w:r>
@@ -1485,14 +1859,35 @@
           <w:b/>
           <w:bCs/>
           <w:u w:val="single"/>
-        </w:rPr>
-      </w:pPr>
-      <w:r>
-        <w:rPr>
-          <w:b/>
-          <w:bCs/>
-          <w:u w:val="single"/>
-        </w:rPr>
+          <w:lang w:val="en-US"/>
+        </w:rPr>
+      </w:pPr>
+    </w:p>
+    <w:p>
+      <w:pPr>
+        <w:rPr>
+          <w:b/>
+          <w:bCs/>
+          <w:u w:val="single"/>
+          <w:lang w:val="en-US"/>
+        </w:rPr>
+      </w:pPr>
+    </w:p>
+    <w:p>
+      <w:pPr>
+        <w:rPr>
+          <w:b/>
+          <w:bCs/>
+          <w:u w:val="single"/>
+        </w:rPr>
+      </w:pPr>
+      <w:r>
+        <w:rPr>
+          <w:b/>
+          <w:bCs/>
+          <w:u w:val="single"/>
+        </w:rPr>
+        <w:lastRenderedPageBreak/>
         <w:t xml:space="preserve">Task-1: </w:t>
       </w:r>
       <w:r>
@@ -1648,15 +2043,7 @@
         <w:t xml:space="preserve">Navigate to ec2 in aws and </w:t>
       </w:r>
       <w:r>
-        <w:t xml:space="preserve">launch </w:t>
-      </w:r>
-      <w:proofErr w:type="gramStart"/>
-      <w:r>
-        <w:t>a</w:t>
-      </w:r>
-      <w:proofErr w:type="gramEnd"/>
-      <w:r>
-        <w:t xml:space="preserve"> instance. </w:t>
+        <w:t xml:space="preserve">launch a instance. </w:t>
       </w:r>
     </w:p>
     <w:p>
@@ -1699,6 +2086,9 @@
         <w:pStyle w:val="ListParagraph"/>
       </w:pPr>
       <w:r>
+        <w:rPr>
+          <w:noProof/>
+        </w:rPr>
         <w:drawing>
           <wp:inline distT="0" distB="0" distL="0" distR="0" wp14:anchorId="00063469" wp14:editId="572E26B7">
             <wp:extent cx="5731510" cy="2153285"/>
@@ -1774,6 +2164,7 @@
         <w:rPr>
           <w:b/>
           <w:bCs/>
+          <w:noProof/>
         </w:rPr>
         <w:lastRenderedPageBreak/>
         <w:drawing>
@@ -1842,6 +2233,9 @@
         <w:pStyle w:val="ListParagraph"/>
       </w:pPr>
       <w:r>
+        <w:rPr>
+          <w:noProof/>
+        </w:rPr>
         <w:drawing>
           <wp:inline distT="0" distB="0" distL="0" distR="0" wp14:anchorId="46025330" wp14:editId="51CF6FD6">
             <wp:extent cx="5731510" cy="2078990"/>
@@ -1901,6 +2295,9 @@
         <w:ind w:left="720"/>
       </w:pPr>
       <w:r>
+        <w:rPr>
+          <w:noProof/>
+        </w:rPr>
         <w:drawing>
           <wp:inline distT="0" distB="0" distL="0" distR="0" wp14:anchorId="7395D99F" wp14:editId="060E94FC">
             <wp:extent cx="5731510" cy="726440"/>
@@ -1966,6 +2363,9 @@
         <w:ind w:left="720"/>
       </w:pPr>
       <w:r>
+        <w:rPr>
+          <w:noProof/>
+        </w:rPr>
         <w:lastRenderedPageBreak/>
         <w:drawing>
           <wp:inline distT="0" distB="0" distL="0" distR="0" wp14:anchorId="7EEBDEB1" wp14:editId="3FBF81E8">
@@ -2014,6 +2414,9 @@
         <w:ind w:left="720"/>
       </w:pPr>
       <w:r>
+        <w:rPr>
+          <w:noProof/>
+        </w:rPr>
         <w:drawing>
           <wp:inline distT="0" distB="0" distL="0" distR="0" wp14:anchorId="43D55C1E" wp14:editId="09262940">
             <wp:extent cx="5731510" cy="5678805"/>
@@ -2082,15 +2485,7 @@
           <w:bCs/>
           <w:color w:val="000000" w:themeColor="text1"/>
         </w:rPr>
-        <w:t>sudo wget -O /etc/yum.repos.d/jenkins.repo</w:t>
-      </w:r>
-      <w:r>
-        <w:rPr>
-          <w:b/>
-          <w:bCs/>
-          <w:color w:val="000000" w:themeColor="text1"/>
-        </w:rPr>
-        <w:t xml:space="preserve"> </w:t>
+        <w:t xml:space="preserve">sudo wget -O /etc/yum.repos.d/jenkins.repo </w:t>
       </w:r>
       <w:hyperlink r:id="rId13" w:history="1">
         <w:r>
@@ -2109,6 +2504,9 @@
         <w:ind w:left="720"/>
       </w:pPr>
       <w:r>
+        <w:rPr>
+          <w:noProof/>
+        </w:rPr>
         <w:drawing>
           <wp:inline distT="0" distB="0" distL="0" distR="0" wp14:anchorId="65842D9F" wp14:editId="13B89FC0">
             <wp:extent cx="5731510" cy="732790"/>
@@ -2204,6 +2602,9 @@
         <w:ind w:left="720"/>
       </w:pPr>
       <w:r>
+        <w:rPr>
+          <w:noProof/>
+        </w:rPr>
         <w:drawing>
           <wp:inline distT="0" distB="0" distL="0" distR="0" wp14:anchorId="2318B9AE" wp14:editId="693DA230">
             <wp:extent cx="5731510" cy="742950"/>
@@ -2280,6 +2681,9 @@
         <w:ind w:left="720"/>
       </w:pPr>
       <w:r>
+        <w:rPr>
+          <w:noProof/>
+        </w:rPr>
         <w:drawing>
           <wp:inline distT="0" distB="0" distL="0" distR="0" wp14:anchorId="0E8A041C" wp14:editId="533AAF2B">
             <wp:extent cx="5613711" cy="4387850"/>
@@ -2341,6 +2745,9 @@
         <w:ind w:left="720"/>
       </w:pPr>
       <w:r>
+        <w:rPr>
+          <w:noProof/>
+        </w:rPr>
         <w:drawing>
           <wp:inline distT="0" distB="0" distL="0" distR="0" wp14:anchorId="719D388F" wp14:editId="7F4A406A">
             <wp:extent cx="5731510" cy="1663700"/>
@@ -2403,6 +2810,9 @@
         <w:ind w:left="720"/>
       </w:pPr>
       <w:r>
+        <w:rPr>
+          <w:noProof/>
+        </w:rPr>
         <w:drawing>
           <wp:inline distT="0" distB="0" distL="0" distR="0" wp14:anchorId="5975560A" wp14:editId="44F55DA3">
             <wp:extent cx="5731510" cy="3463290"/>
@@ -2461,10 +2871,7 @@
         <w:t xml:space="preserve">Step 7: </w:t>
       </w:r>
       <w:r>
-        <w:t xml:space="preserve">Deployment location of Jenkins is </w:t>
-      </w:r>
-      <w:r>
-        <w:t>/var/lib/Jenkins</w:t>
+        <w:t>Deployment location of Jenkins is /var/lib/Jenkins</w:t>
       </w:r>
     </w:p>
     <w:p>
@@ -2511,6 +2918,7 @@
         <w:rPr>
           <w:b/>
           <w:bCs/>
+          <w:noProof/>
         </w:rPr>
         <w:lastRenderedPageBreak/>
         <w:drawing>
@@ -2574,6 +2982,7 @@
         <w:rPr>
           <w:b/>
           <w:bCs/>
+          <w:noProof/>
         </w:rPr>
         <w:drawing>
           <wp:inline distT="0" distB="0" distL="0" distR="0" wp14:anchorId="5C6EA31D" wp14:editId="1CC6C8C1">
@@ -2660,6 +3069,7 @@
         <w:rPr>
           <w:b/>
           <w:bCs/>
+          <w:noProof/>
         </w:rPr>
         <w:lastRenderedPageBreak/>
         <w:drawing>
@@ -2716,6 +3126,9 @@
         <w:ind w:left="720"/>
       </w:pPr>
       <w:r>
+        <w:rPr>
+          <w:noProof/>
+        </w:rPr>
         <w:drawing>
           <wp:inline distT="0" distB="0" distL="0" distR="0" wp14:anchorId="3A562B36" wp14:editId="1BDCE84B">
             <wp:extent cx="5731510" cy="3115310"/>
@@ -2790,15 +3203,7 @@
           <w:b/>
           <w:bCs/>
         </w:rPr>
-        <w:t xml:space="preserve"> </w:t>
-      </w:r>
-      <w:proofErr w:type="gramStart"/>
-      <w:r>
-        <w:rPr>
-          <w:b/>
-          <w:bCs/>
-        </w:rPr>
-        <w:t xml:space="preserve">vi  </w:t>
+        <w:t xml:space="preserve"> vi  </w:t>
       </w:r>
       <w:r>
         <w:rPr>
@@ -2807,17 +3212,7 @@
           <w:sz w:val="18"/>
           <w:szCs w:val="18"/>
         </w:rPr>
-        <w:t>/usr/lib/systemd/system/Jenkins.service</w:t>
-      </w:r>
-      <w:proofErr w:type="gramEnd"/>
-      <w:r>
-        <w:rPr>
-          <w:rFonts w:ascii="Lucida Console" w:hAnsi="Lucida Console" w:cs="Lucida Console"/>
-          <w:kern w:val="0"/>
-          <w:sz w:val="18"/>
-          <w:szCs w:val="18"/>
-        </w:rPr>
-        <w:t xml:space="preserve">. </w:t>
+        <w:t xml:space="preserve">/usr/lib/systemd/system/Jenkins.service. </w:t>
       </w:r>
     </w:p>
     <w:p>
@@ -2945,6 +3340,9 @@
         <w:ind w:left="720"/>
       </w:pPr>
       <w:r>
+        <w:rPr>
+          <w:noProof/>
+        </w:rPr>
         <w:drawing>
           <wp:inline distT="0" distB="0" distL="0" distR="0" wp14:anchorId="579341EE" wp14:editId="2B4EBAD8">
             <wp:extent cx="5731510" cy="2475865"/>
@@ -3088,15 +3486,7 @@
           <w:u w:val="single"/>
         </w:rPr>
         <w:lastRenderedPageBreak/>
-        <w:t xml:space="preserve">Task-2: </w:t>
-      </w:r>
-      <w:r>
-        <w:rPr>
-          <w:b/>
-          <w:bCs/>
-          <w:u w:val="single"/>
-        </w:rPr>
-        <w:t xml:space="preserve">Secure Jenkins server </w:t>
+        <w:t xml:space="preserve">Task-2: Secure Jenkins server </w:t>
       </w:r>
     </w:p>
     <w:p>
@@ -3403,6 +3793,7 @@
         <w:rPr>
           <w:b/>
           <w:bCs/>
+          <w:noProof/>
           <w:u w:val="single"/>
         </w:rPr>
         <w:lastRenderedPageBreak/>
@@ -3516,6 +3907,9 @@
         </w:rPr>
       </w:pPr>
       <w:r>
+        <w:rPr>
+          <w:noProof/>
+        </w:rPr>
         <w:drawing>
           <wp:inline distT="0" distB="0" distL="0" distR="0" wp14:anchorId="71614EF1" wp14:editId="4A45F8AB">
             <wp:extent cx="4967722" cy="4064000"/>
@@ -3575,6 +3969,9 @@
         </w:rPr>
       </w:pPr>
       <w:r>
+        <w:rPr>
+          <w:noProof/>
+        </w:rPr>
         <w:lastRenderedPageBreak/>
         <w:drawing>
           <wp:inline distT="0" distB="0" distL="0" distR="0" wp14:anchorId="350B4491" wp14:editId="5E218FEE">
@@ -3995,6 +4392,9 @@
         <w:pStyle w:val="ListParagraph"/>
       </w:pPr>
       <w:r>
+        <w:rPr>
+          <w:noProof/>
+        </w:rPr>
         <w:drawing>
           <wp:inline distT="0" distB="0" distL="0" distR="0" wp14:anchorId="7B9F1F0E" wp14:editId="5F8570C8">
             <wp:extent cx="5731510" cy="2893060"/>
@@ -4062,6 +4462,9 @@
         <w:pStyle w:val="ListParagraph"/>
       </w:pPr>
       <w:r>
+        <w:rPr>
+          <w:noProof/>
+        </w:rPr>
         <w:drawing>
           <wp:inline distT="0" distB="0" distL="0" distR="0" wp14:anchorId="2CF83010" wp14:editId="4FEBF1A1">
             <wp:extent cx="5731510" cy="1544320"/>
@@ -4151,6 +4554,9 @@
         <w:pStyle w:val="ListParagraph"/>
       </w:pPr>
       <w:r>
+        <w:rPr>
+          <w:noProof/>
+        </w:rPr>
         <w:lastRenderedPageBreak/>
         <w:drawing>
           <wp:inline distT="0" distB="0" distL="0" distR="0" wp14:anchorId="32C5EE86" wp14:editId="75416D59">
@@ -4218,6 +4624,9 @@
         <w:pStyle w:val="ListParagraph"/>
       </w:pPr>
       <w:r>
+        <w:rPr>
+          <w:noProof/>
+        </w:rPr>
         <w:drawing>
           <wp:inline distT="0" distB="0" distL="0" distR="0" wp14:anchorId="22A9AE21" wp14:editId="06DD93A0">
             <wp:extent cx="5067300" cy="1458547"/>
@@ -4294,6 +4703,9 @@
         <w:pStyle w:val="ListParagraph"/>
       </w:pPr>
       <w:r>
+        <w:rPr>
+          <w:noProof/>
+        </w:rPr>
         <w:drawing>
           <wp:inline distT="0" distB="0" distL="0" distR="0" wp14:anchorId="03D0B5C1" wp14:editId="4FB5C63F">
             <wp:extent cx="4600128" cy="3289300"/>
@@ -4364,6 +4776,9 @@
         <w:pStyle w:val="ListParagraph"/>
       </w:pPr>
       <w:r>
+        <w:rPr>
+          <w:noProof/>
+        </w:rPr>
         <w:drawing>
           <wp:inline distT="0" distB="0" distL="0" distR="0" wp14:anchorId="26BD2F18" wp14:editId="54ECEAC6">
             <wp:extent cx="5731510" cy="1886585"/>
@@ -4447,6 +4862,7 @@
         <w:rPr>
           <w:b/>
           <w:bCs/>
+          <w:noProof/>
           <w:u w:val="single"/>
         </w:rPr>
         <w:drawing>
@@ -4534,6 +4950,7 @@
         <w:rPr>
           <w:b/>
           <w:bCs/>
+          <w:noProof/>
           <w:u w:val="single"/>
         </w:rPr>
         <w:drawing>
@@ -4620,6 +5037,7 @@
         <w:rPr>
           <w:b/>
           <w:bCs/>
+          <w:noProof/>
           <w:u w:val="single"/>
         </w:rPr>
         <w:drawing>
@@ -4704,6 +5122,7 @@
         <w:rPr>
           <w:b/>
           <w:bCs/>
+          <w:noProof/>
           <w:u w:val="single"/>
         </w:rPr>
         <w:drawing>
@@ -4806,6 +5225,7 @@
         <w:rPr>
           <w:b/>
           <w:bCs/>
+          <w:noProof/>
           <w:u w:val="single"/>
         </w:rPr>
         <w:drawing>
@@ -4861,35 +5281,33 @@
         <w:t xml:space="preserve">Now, we added 2 users to the </w:t>
       </w:r>
       <w:r>
-        <w:t>Project-based Matrix Authorization Strategy</w:t>
-      </w:r>
-      <w:r>
-        <w:t xml:space="preserve"> and provided just access to “Job” except delete option. </w:t>
-      </w:r>
-    </w:p>
-    <w:p>
-      <w:pPr>
-        <w:pStyle w:val="ListParagraph"/>
-        <w:rPr>
-          <w:b/>
-          <w:bCs/>
-          <w:u w:val="single"/>
-        </w:rPr>
-      </w:pPr>
-    </w:p>
-    <w:p>
-      <w:pPr>
-        <w:pStyle w:val="ListParagraph"/>
-        <w:rPr>
-          <w:b/>
-          <w:bCs/>
-          <w:u w:val="single"/>
-        </w:rPr>
-      </w:pPr>
-      <w:r>
-        <w:rPr>
-          <w:b/>
-          <w:bCs/>
+        <w:t xml:space="preserve">Project-based Matrix Authorization Strategy and provided just access to “Job” except delete option. </w:t>
+      </w:r>
+    </w:p>
+    <w:p>
+      <w:pPr>
+        <w:pStyle w:val="ListParagraph"/>
+        <w:rPr>
+          <w:b/>
+          <w:bCs/>
+          <w:u w:val="single"/>
+        </w:rPr>
+      </w:pPr>
+    </w:p>
+    <w:p>
+      <w:pPr>
+        <w:pStyle w:val="ListParagraph"/>
+        <w:rPr>
+          <w:b/>
+          <w:bCs/>
+          <w:u w:val="single"/>
+        </w:rPr>
+      </w:pPr>
+      <w:r>
+        <w:rPr>
+          <w:b/>
+          <w:bCs/>
+          <w:noProof/>
           <w:u w:val="single"/>
         </w:rPr>
         <w:drawing>
@@ -4968,15 +5386,7 @@
         <w:t xml:space="preserve"> </w:t>
       </w:r>
       <w:r>
-        <w:t xml:space="preserve">Always provide permissions correctly to ensure, we do not need to have </w:t>
-      </w:r>
-      <w:proofErr w:type="gramStart"/>
-      <w:r>
-        <w:t>a</w:t>
-      </w:r>
-      <w:proofErr w:type="gramEnd"/>
-      <w:r>
-        <w:t xml:space="preserve"> </w:t>
+        <w:t xml:space="preserve">Always provide permissions correctly to ensure, we do not need to have a </w:t>
       </w:r>
       <w:r>
         <w:t xml:space="preserve">error at some stage that, someone working at a wrong place might result in Jenkins </w:t>
@@ -5153,6 +5563,9 @@
       <w:r>
         <w:t>Jenkins</w:t>
       </w:r>
+      <w:r>
+        <w:t>- Node, Labels</w:t>
+      </w:r>
     </w:p>
     <w:p>
       <w:pPr>
@@ -5230,6 +5643,9 @@
         <w:pStyle w:val="ListParagraph"/>
       </w:pPr>
       <w:r>
+        <w:rPr>
+          <w:noProof/>
+        </w:rPr>
         <w:lastRenderedPageBreak/>
         <w:drawing>
           <wp:inline distT="0" distB="0" distL="0" distR="0" wp14:anchorId="3FA2AC5E" wp14:editId="3F80C585">
@@ -5296,6 +5712,9 @@
         <w:pStyle w:val="ListParagraph"/>
       </w:pPr>
       <w:r>
+        <w:rPr>
+          <w:noProof/>
+        </w:rPr>
         <w:drawing>
           <wp:inline distT="0" distB="0" distL="0" distR="0" wp14:anchorId="301E2822" wp14:editId="180AD625">
             <wp:extent cx="5731510" cy="2018030"/>
@@ -5361,6 +5780,9 @@
         <w:pStyle w:val="ListParagraph"/>
       </w:pPr>
       <w:r>
+        <w:rPr>
+          <w:noProof/>
+        </w:rPr>
         <w:drawing>
           <wp:inline distT="0" distB="0" distL="0" distR="0" wp14:anchorId="70A168D5" wp14:editId="3E62AD45">
             <wp:extent cx="5731510" cy="2484755"/>
@@ -5464,6 +5886,7 @@
         <w:rPr>
           <w:b/>
           <w:bCs/>
+          <w:noProof/>
           <w:u w:val="single"/>
         </w:rPr>
         <w:drawing>
@@ -5538,6 +5961,7 @@
         <w:rPr>
           <w:b/>
           <w:bCs/>
+          <w:noProof/>
           <w:u w:val="single"/>
         </w:rPr>
         <w:drawing>
@@ -5628,6 +6052,7 @@
         <w:rPr>
           <w:b/>
           <w:bCs/>
+          <w:noProof/>
           <w:u w:val="single"/>
         </w:rPr>
         <w:lastRenderedPageBreak/>
@@ -5690,25 +6115,7 @@
         <w:t xml:space="preserve">Create a job now and </w:t>
       </w:r>
       <w:r>
-        <w:t xml:space="preserve">enter </w:t>
-      </w:r>
-      <w:proofErr w:type="spellStart"/>
-      <w:proofErr w:type="gramStart"/>
-      <w:r>
-        <w:t>a</w:t>
-      </w:r>
-      <w:proofErr w:type="spellEnd"/>
-      <w:proofErr w:type="gramEnd"/>
-      <w:r>
-        <w:t xml:space="preserve"> item name- </w:t>
-      </w:r>
-      <w:proofErr w:type="spellStart"/>
-      <w:r>
-        <w:t>Devops_Team</w:t>
-      </w:r>
-      <w:proofErr w:type="spellEnd"/>
-      <w:r>
-        <w:t xml:space="preserve"> and choose Freestyle Project. </w:t>
+        <w:t xml:space="preserve">enter a item name- Devops_Team and choose Freestyle Project. </w:t>
       </w:r>
     </w:p>
     <w:p>
@@ -5724,6 +6131,7 @@
         <w:rPr>
           <w:b/>
           <w:bCs/>
+          <w:noProof/>
           <w:u w:val="single"/>
         </w:rPr>
         <w:drawing>
@@ -5816,6 +6224,7 @@
         <w:rPr>
           <w:b/>
           <w:bCs/>
+          <w:noProof/>
           <w:u w:val="single"/>
         </w:rPr>
         <w:lastRenderedPageBreak/>
@@ -5878,13 +6287,8 @@
         <w:t xml:space="preserve">Step 4: </w:t>
       </w:r>
       <w:r>
-        <w:t xml:space="preserve">Navigate to GitHub and search for </w:t>
-      </w:r>
-      <w:proofErr w:type="spellStart"/>
-      <w:r>
-        <w:t>sabear_simplecutomerapp</w:t>
-      </w:r>
-      <w:proofErr w:type="spellEnd"/>
+        <w:t>Navigate to GitHub and search for sabear_simplecutomerapp</w:t>
+      </w:r>
       <w:r>
         <w:t xml:space="preserve"> and copy the ssh and paste in the </w:t>
       </w:r>
@@ -5908,6 +6312,7 @@
         <w:rPr>
           <w:b/>
           <w:bCs/>
+          <w:noProof/>
           <w:u w:val="single"/>
         </w:rPr>
         <w:drawing>
@@ -5993,6 +6398,7 @@
         <w:rPr>
           <w:b/>
           <w:bCs/>
+          <w:noProof/>
           <w:u w:val="single"/>
         </w:rPr>
         <w:lastRenderedPageBreak/>
@@ -6083,6 +6489,9 @@
         <w:pStyle w:val="ListParagraph"/>
       </w:pPr>
       <w:r>
+        <w:rPr>
+          <w:noProof/>
+        </w:rPr>
         <w:drawing>
           <wp:inline distT="0" distB="0" distL="0" distR="0" wp14:anchorId="4136D4A1" wp14:editId="45795409">
             <wp:extent cx="5731510" cy="4803775"/>
@@ -6168,6 +6577,9 @@
         <w:pStyle w:val="ListParagraph"/>
       </w:pPr>
       <w:r>
+        <w:rPr>
+          <w:noProof/>
+        </w:rPr>
         <w:drawing>
           <wp:inline distT="0" distB="0" distL="0" distR="0" wp14:anchorId="1F0065E8" wp14:editId="3EFD22AD">
             <wp:extent cx="5731510" cy="2365375"/>
@@ -6246,6 +6658,9 @@
         <w:pStyle w:val="ListParagraph"/>
       </w:pPr>
       <w:r>
+        <w:rPr>
+          <w:noProof/>
+        </w:rPr>
         <w:drawing>
           <wp:inline distT="0" distB="0" distL="0" distR="0" wp14:anchorId="254C6131" wp14:editId="1C495F7E">
             <wp:extent cx="5731510" cy="3145790"/>
@@ -6310,6 +6725,9 @@
         <w:pStyle w:val="ListParagraph"/>
       </w:pPr>
       <w:r>
+        <w:rPr>
+          <w:noProof/>
+        </w:rPr>
         <w:lastRenderedPageBreak/>
         <w:drawing>
           <wp:inline distT="0" distB="0" distL="0" distR="0" wp14:anchorId="68D8A245" wp14:editId="749C4244">
@@ -6384,6 +6802,7 @@
         <w:rPr>
           <w:b/>
           <w:bCs/>
+          <w:noProof/>
           <w:u w:val="single"/>
         </w:rPr>
         <w:drawing>
@@ -6682,6 +7101,7 @@
       </w:pPr>
       <w:r>
         <w:rPr>
+          <w:noProof/>
           <w:lang w:val="en-US"/>
         </w:rPr>
         <w:drawing>
@@ -6748,6 +7168,7 @@
       </w:pPr>
       <w:r>
         <w:rPr>
+          <w:noProof/>
           <w:lang w:val="en-US"/>
         </w:rPr>
         <w:drawing>
@@ -6823,6 +7244,7 @@
       </w:pPr>
       <w:r>
         <w:rPr>
+          <w:noProof/>
           <w:lang w:val="en-US"/>
         </w:rPr>
         <w:drawing>
@@ -6889,6 +7311,7 @@
       </w:pPr>
       <w:r>
         <w:rPr>
+          <w:noProof/>
           <w:lang w:val="en-US"/>
         </w:rPr>
         <w:drawing>
@@ -6963,6 +7386,7 @@
       </w:pPr>
       <w:r>
         <w:rPr>
+          <w:noProof/>
           <w:lang w:val="en-US"/>
         </w:rPr>
         <w:lastRenderedPageBreak/>
@@ -7042,6 +7466,7 @@
       </w:pPr>
       <w:r>
         <w:rPr>
+          <w:noProof/>
           <w:lang w:val="en-US"/>
         </w:rPr>
         <w:drawing>
@@ -7098,6 +7523,9 @@
         <w:ind w:left="720"/>
       </w:pPr>
       <w:r>
+        <w:rPr>
+          <w:noProof/>
+        </w:rPr>
         <w:drawing>
           <wp:inline distT="0" distB="0" distL="0" distR="0" wp14:anchorId="3E2C5034" wp14:editId="104AB74F">
             <wp:extent cx="5731510" cy="1955800"/>
@@ -7140,6 +7568,9 @@
         <w:ind w:left="720"/>
       </w:pPr>
       <w:r>
+        <w:rPr>
+          <w:noProof/>
+        </w:rPr>
         <w:lastRenderedPageBreak/>
         <w:drawing>
           <wp:inline distT="0" distB="0" distL="0" distR="0" wp14:anchorId="422679D2" wp14:editId="03452A84">
@@ -7214,6 +7645,7 @@
         <w:rPr>
           <w:b/>
           <w:bCs/>
+          <w:noProof/>
         </w:rPr>
         <w:drawing>
           <wp:inline distT="0" distB="0" distL="0" distR="0" wp14:anchorId="2C925A2D" wp14:editId="3DE00064">
@@ -7277,15 +7709,7 @@
         <w:t xml:space="preserve">We took 3 sample jobs in Free style, configures with Labels which we created earlier and validated with one of the job </w:t>
       </w:r>
       <w:r>
-        <w:t xml:space="preserve">incorrect and made sure </w:t>
-      </w:r>
-      <w:proofErr w:type="gramStart"/>
-      <w:r>
-        <w:t>its</w:t>
-      </w:r>
-      <w:proofErr w:type="gramEnd"/>
-      <w:r>
-        <w:t xml:space="preserve"> working well and validated. </w:t>
+        <w:t xml:space="preserve">incorrect and made sure its working well and validated. </w:t>
       </w:r>
     </w:p>
     <w:sectPr>
@@ -7301,6 +7725,119 @@
 <file path=word/numbering.xml><?xml version="1.0" encoding="utf-8"?>
 <w:numbering xmlns:wpc="http://schemas.microsoft.com/office/word/2010/wordprocessingCanvas" xmlns:cx="http://schemas.microsoft.com/office/drawing/2014/chartex" xmlns:cx1="http://schemas.microsoft.com/office/drawing/2015/9/8/chartex" xmlns:cx2="http://schemas.microsoft.com/office/drawing/2015/10/21/chartex" xmlns:cx3="http://schemas.microsoft.com/office/drawing/2016/5/9/chartex" xmlns:cx4="http://schemas.microsoft.com/office/drawing/2016/5/10/chartex" xmlns:cx5="http://schemas.microsoft.com/office/drawing/2016/5/11/chartex" xmlns:cx6="http://schemas.microsoft.com/office/drawing/2016/5/12/chartex" xmlns:cx7="http://schemas.microsoft.com/office/drawing/2016/5/13/chartex" xmlns:cx8="http://schemas.microsoft.com/office/drawing/2016/5/14/chartex" xmlns:mc="http://schemas.openxmlformats.org/markup-compatibility/2006" xmlns:aink="http://schemas.microsoft.com/office/drawing/2016/ink" xmlns:am3d="http://schemas.microsoft.com/office/drawing/2017/model3d" xmlns:o="urn:schemas-microsoft-com:office:office" xmlns:oel="http://schemas.microsoft.com/office/2019/extlst" xmlns:r="http://schemas.openxmlformats.org/officeDocument/2006/relationships" xmlns:m="http://schemas.openxmlformats.org/officeDocument/2006/math" xmlns:v="urn:schemas-microsoft-com:vml" xmlns:wp14="http://schemas.microsoft.com/office/word/2010/wordprocessingDrawing" xmlns:wp="http://schemas.openxmlformats.org/drawingml/2006/wordprocessingDrawing" xmlns:w10="urn:schemas-microsoft-com:office:word" xmlns:w="http://schemas.openxmlformats.org/wordprocessingml/2006/main" xmlns:w14="http://schemas.microsoft.com/office/word/2010/wordml" xmlns:w15="http://schemas.microsoft.com/office/word/2012/wordml" xmlns:w16cex="http://schemas.microsoft.com/office/word/2018/wordml/cex" xmlns:w16cid="http://schemas.microsoft.com/office/word/2016/wordml/cid" xmlns:w16="http://schemas.microsoft.com/office/word/2018/wordml" xmlns:w16du="http://schemas.microsoft.com/office/word/2023/wordml/word16du" xmlns:w16sdtdh="http://schemas.microsoft.com/office/word/2020/wordml/sdtdatahash" xmlns:w16sdtfl="http://schemas.microsoft.com/office/word/2024/wordml/sdtformatlock" xmlns:w16se="http://schemas.microsoft.com/office/word/2015/wordml/symex" xmlns:wpg="http://schemas.microsoft.com/office/word/2010/wordprocessingGroup" xmlns:wpi="http://schemas.microsoft.com/office/word/2010/wordprocessingInk" xmlns:wne="http://schemas.microsoft.com/office/word/2006/wordml" xmlns:wps="http://schemas.microsoft.com/office/word/2010/wordprocessingShape" mc:Ignorable="w14 w15 w16se w16cid w16 w16cex w16sdtdh w16sdtfl w16du wp14">
   <w:abstractNum w:abstractNumId="0" w15:restartNumberingAfterBreak="0">
+    <w:nsid w:val="033B2AD8"/>
+    <w:multiLevelType w:val="hybridMultilevel"/>
+    <w:tmpl w:val="91D078F4"/>
+    <w:lvl w:ilvl="0" w:tplc="40090001">
+      <w:start w:val="1"/>
+      <w:numFmt w:val="bullet"/>
+      <w:lvlText w:val=""/>
+      <w:lvlJc w:val="left"/>
+      <w:pPr>
+        <w:ind w:left="720" w:hanging="360"/>
+      </w:pPr>
+      <w:rPr>
+        <w:rFonts w:ascii="Symbol" w:hAnsi="Symbol" w:hint="default"/>
+      </w:rPr>
+    </w:lvl>
+    <w:lvl w:ilvl="1" w:tplc="40090003" w:tentative="1">
+      <w:start w:val="1"/>
+      <w:numFmt w:val="bullet"/>
+      <w:lvlText w:val="o"/>
+      <w:lvlJc w:val="left"/>
+      <w:pPr>
+        <w:ind w:left="1440" w:hanging="360"/>
+      </w:pPr>
+      <w:rPr>
+        <w:rFonts w:ascii="Courier New" w:hAnsi="Courier New" w:cs="Courier New" w:hint="default"/>
+      </w:rPr>
+    </w:lvl>
+    <w:lvl w:ilvl="2" w:tplc="40090005" w:tentative="1">
+      <w:start w:val="1"/>
+      <w:numFmt w:val="bullet"/>
+      <w:lvlText w:val=""/>
+      <w:lvlJc w:val="left"/>
+      <w:pPr>
+        <w:ind w:left="2160" w:hanging="360"/>
+      </w:pPr>
+      <w:rPr>
+        <w:rFonts w:ascii="Wingdings" w:hAnsi="Wingdings" w:hint="default"/>
+      </w:rPr>
+    </w:lvl>
+    <w:lvl w:ilvl="3" w:tplc="40090001" w:tentative="1">
+      <w:start w:val="1"/>
+      <w:numFmt w:val="bullet"/>
+      <w:lvlText w:val=""/>
+      <w:lvlJc w:val="left"/>
+      <w:pPr>
+        <w:ind w:left="2880" w:hanging="360"/>
+      </w:pPr>
+      <w:rPr>
+        <w:rFonts w:ascii="Symbol" w:hAnsi="Symbol" w:hint="default"/>
+      </w:rPr>
+    </w:lvl>
+    <w:lvl w:ilvl="4" w:tplc="40090003" w:tentative="1">
+      <w:start w:val="1"/>
+      <w:numFmt w:val="bullet"/>
+      <w:lvlText w:val="o"/>
+      <w:lvlJc w:val="left"/>
+      <w:pPr>
+        <w:ind w:left="3600" w:hanging="360"/>
+      </w:pPr>
+      <w:rPr>
+        <w:rFonts w:ascii="Courier New" w:hAnsi="Courier New" w:cs="Courier New" w:hint="default"/>
+      </w:rPr>
+    </w:lvl>
+    <w:lvl w:ilvl="5" w:tplc="40090005" w:tentative="1">
+      <w:start w:val="1"/>
+      <w:numFmt w:val="bullet"/>
+      <w:lvlText w:val=""/>
+      <w:lvlJc w:val="left"/>
+      <w:pPr>
+        <w:ind w:left="4320" w:hanging="360"/>
+      </w:pPr>
+      <w:rPr>
+        <w:rFonts w:ascii="Wingdings" w:hAnsi="Wingdings" w:hint="default"/>
+      </w:rPr>
+    </w:lvl>
+    <w:lvl w:ilvl="6" w:tplc="40090001" w:tentative="1">
+      <w:start w:val="1"/>
+      <w:numFmt w:val="bullet"/>
+      <w:lvlText w:val=""/>
+      <w:lvlJc w:val="left"/>
+      <w:pPr>
+        <w:ind w:left="5040" w:hanging="360"/>
+      </w:pPr>
+      <w:rPr>
+        <w:rFonts w:ascii="Symbol" w:hAnsi="Symbol" w:hint="default"/>
+      </w:rPr>
+    </w:lvl>
+    <w:lvl w:ilvl="7" w:tplc="40090003" w:tentative="1">
+      <w:start w:val="1"/>
+      <w:numFmt w:val="bullet"/>
+      <w:lvlText w:val="o"/>
+      <w:lvlJc w:val="left"/>
+      <w:pPr>
+        <w:ind w:left="5760" w:hanging="360"/>
+      </w:pPr>
+      <w:rPr>
+        <w:rFonts w:ascii="Courier New" w:hAnsi="Courier New" w:cs="Courier New" w:hint="default"/>
+      </w:rPr>
+    </w:lvl>
+    <w:lvl w:ilvl="8" w:tplc="40090005" w:tentative="1">
+      <w:start w:val="1"/>
+      <w:numFmt w:val="bullet"/>
+      <w:lvlText w:val=""/>
+      <w:lvlJc w:val="left"/>
+      <w:pPr>
+        <w:ind w:left="6480" w:hanging="360"/>
+      </w:pPr>
+      <w:rPr>
+        <w:rFonts w:ascii="Wingdings" w:hAnsi="Wingdings" w:hint="default"/>
+      </w:rPr>
+    </w:lvl>
+  </w:abstractNum>
+  <w:abstractNum w:abstractNumId="1" w15:restartNumberingAfterBreak="0">
     <w:nsid w:val="04067B5F"/>
     <w:multiLevelType w:val="hybridMultilevel"/>
     <w:tmpl w:val="856AD7DA"/>
@@ -7413,7 +7950,7 @@
       </w:rPr>
     </w:lvl>
   </w:abstractNum>
-  <w:abstractNum w:abstractNumId="1" w15:restartNumberingAfterBreak="0">
+  <w:abstractNum w:abstractNumId="2" w15:restartNumberingAfterBreak="0">
     <w:nsid w:val="09AF3C84"/>
     <w:multiLevelType w:val="hybridMultilevel"/>
     <w:tmpl w:val="A5B6CFC4"/>
@@ -7526,7 +8063,7 @@
       </w:rPr>
     </w:lvl>
   </w:abstractNum>
-  <w:abstractNum w:abstractNumId="2" w15:restartNumberingAfterBreak="0">
+  <w:abstractNum w:abstractNumId="3" w15:restartNumberingAfterBreak="0">
     <w:nsid w:val="0B1300E3"/>
     <w:multiLevelType w:val="hybridMultilevel"/>
     <w:tmpl w:val="81CACA76"/>
@@ -7639,7 +8176,7 @@
       </w:rPr>
     </w:lvl>
   </w:abstractNum>
-  <w:abstractNum w:abstractNumId="3" w15:restartNumberingAfterBreak="0">
+  <w:abstractNum w:abstractNumId="4" w15:restartNumberingAfterBreak="0">
     <w:nsid w:val="0D9E282D"/>
     <w:multiLevelType w:val="hybridMultilevel"/>
     <w:tmpl w:val="9C04C71E"/>
@@ -7752,7 +8289,7 @@
       </w:rPr>
     </w:lvl>
   </w:abstractNum>
-  <w:abstractNum w:abstractNumId="4" w15:restartNumberingAfterBreak="0">
+  <w:abstractNum w:abstractNumId="5" w15:restartNumberingAfterBreak="0">
     <w:nsid w:val="115C275F"/>
     <w:multiLevelType w:val="multilevel"/>
     <w:tmpl w:val="2CBCA4BE"/>
@@ -7865,7 +8402,7 @@
       </w:pPr>
     </w:lvl>
   </w:abstractNum>
-  <w:abstractNum w:abstractNumId="5" w15:restartNumberingAfterBreak="0">
+  <w:abstractNum w:abstractNumId="6" w15:restartNumberingAfterBreak="0">
     <w:nsid w:val="151326BB"/>
     <w:multiLevelType w:val="hybridMultilevel"/>
     <w:tmpl w:val="58A4E7A2"/>
@@ -7978,7 +8515,120 @@
       </w:rPr>
     </w:lvl>
   </w:abstractNum>
-  <w:abstractNum w:abstractNumId="6" w15:restartNumberingAfterBreak="0">
+  <w:abstractNum w:abstractNumId="7" w15:restartNumberingAfterBreak="0">
+    <w:nsid w:val="1F0254D3"/>
+    <w:multiLevelType w:val="hybridMultilevel"/>
+    <w:tmpl w:val="F7646708"/>
+    <w:lvl w:ilvl="0" w:tplc="40090001">
+      <w:start w:val="1"/>
+      <w:numFmt w:val="bullet"/>
+      <w:lvlText w:val=""/>
+      <w:lvlJc w:val="left"/>
+      <w:pPr>
+        <w:ind w:left="720" w:hanging="360"/>
+      </w:pPr>
+      <w:rPr>
+        <w:rFonts w:ascii="Symbol" w:hAnsi="Symbol" w:hint="default"/>
+      </w:rPr>
+    </w:lvl>
+    <w:lvl w:ilvl="1" w:tplc="40090003" w:tentative="1">
+      <w:start w:val="1"/>
+      <w:numFmt w:val="bullet"/>
+      <w:lvlText w:val="o"/>
+      <w:lvlJc w:val="left"/>
+      <w:pPr>
+        <w:ind w:left="1440" w:hanging="360"/>
+      </w:pPr>
+      <w:rPr>
+        <w:rFonts w:ascii="Courier New" w:hAnsi="Courier New" w:cs="Courier New" w:hint="default"/>
+      </w:rPr>
+    </w:lvl>
+    <w:lvl w:ilvl="2" w:tplc="40090005" w:tentative="1">
+      <w:start w:val="1"/>
+      <w:numFmt w:val="bullet"/>
+      <w:lvlText w:val=""/>
+      <w:lvlJc w:val="left"/>
+      <w:pPr>
+        <w:ind w:left="2160" w:hanging="360"/>
+      </w:pPr>
+      <w:rPr>
+        <w:rFonts w:ascii="Wingdings" w:hAnsi="Wingdings" w:hint="default"/>
+      </w:rPr>
+    </w:lvl>
+    <w:lvl w:ilvl="3" w:tplc="40090001" w:tentative="1">
+      <w:start w:val="1"/>
+      <w:numFmt w:val="bullet"/>
+      <w:lvlText w:val=""/>
+      <w:lvlJc w:val="left"/>
+      <w:pPr>
+        <w:ind w:left="2880" w:hanging="360"/>
+      </w:pPr>
+      <w:rPr>
+        <w:rFonts w:ascii="Symbol" w:hAnsi="Symbol" w:hint="default"/>
+      </w:rPr>
+    </w:lvl>
+    <w:lvl w:ilvl="4" w:tplc="40090003" w:tentative="1">
+      <w:start w:val="1"/>
+      <w:numFmt w:val="bullet"/>
+      <w:lvlText w:val="o"/>
+      <w:lvlJc w:val="left"/>
+      <w:pPr>
+        <w:ind w:left="3600" w:hanging="360"/>
+      </w:pPr>
+      <w:rPr>
+        <w:rFonts w:ascii="Courier New" w:hAnsi="Courier New" w:cs="Courier New" w:hint="default"/>
+      </w:rPr>
+    </w:lvl>
+    <w:lvl w:ilvl="5" w:tplc="40090005" w:tentative="1">
+      <w:start w:val="1"/>
+      <w:numFmt w:val="bullet"/>
+      <w:lvlText w:val=""/>
+      <w:lvlJc w:val="left"/>
+      <w:pPr>
+        <w:ind w:left="4320" w:hanging="360"/>
+      </w:pPr>
+      <w:rPr>
+        <w:rFonts w:ascii="Wingdings" w:hAnsi="Wingdings" w:hint="default"/>
+      </w:rPr>
+    </w:lvl>
+    <w:lvl w:ilvl="6" w:tplc="40090001" w:tentative="1">
+      <w:start w:val="1"/>
+      <w:numFmt w:val="bullet"/>
+      <w:lvlText w:val=""/>
+      <w:lvlJc w:val="left"/>
+      <w:pPr>
+        <w:ind w:left="5040" w:hanging="360"/>
+      </w:pPr>
+      <w:rPr>
+        <w:rFonts w:ascii="Symbol" w:hAnsi="Symbol" w:hint="default"/>
+      </w:rPr>
+    </w:lvl>
+    <w:lvl w:ilvl="7" w:tplc="40090003" w:tentative="1">
+      <w:start w:val="1"/>
+      <w:numFmt w:val="bullet"/>
+      <w:lvlText w:val="o"/>
+      <w:lvlJc w:val="left"/>
+      <w:pPr>
+        <w:ind w:left="5760" w:hanging="360"/>
+      </w:pPr>
+      <w:rPr>
+        <w:rFonts w:ascii="Courier New" w:hAnsi="Courier New" w:cs="Courier New" w:hint="default"/>
+      </w:rPr>
+    </w:lvl>
+    <w:lvl w:ilvl="8" w:tplc="40090005" w:tentative="1">
+      <w:start w:val="1"/>
+      <w:numFmt w:val="bullet"/>
+      <w:lvlText w:val=""/>
+      <w:lvlJc w:val="left"/>
+      <w:pPr>
+        <w:ind w:left="6480" w:hanging="360"/>
+      </w:pPr>
+      <w:rPr>
+        <w:rFonts w:ascii="Wingdings" w:hAnsi="Wingdings" w:hint="default"/>
+      </w:rPr>
+    </w:lvl>
+  </w:abstractNum>
+  <w:abstractNum w:abstractNumId="8" w15:restartNumberingAfterBreak="0">
     <w:nsid w:val="21C123E6"/>
     <w:multiLevelType w:val="hybridMultilevel"/>
     <w:tmpl w:val="829AC228"/>
@@ -8091,7 +8741,7 @@
       </w:rPr>
     </w:lvl>
   </w:abstractNum>
-  <w:abstractNum w:abstractNumId="7" w15:restartNumberingAfterBreak="0">
+  <w:abstractNum w:abstractNumId="9" w15:restartNumberingAfterBreak="0">
     <w:nsid w:val="35500E96"/>
     <w:multiLevelType w:val="hybridMultilevel"/>
     <w:tmpl w:val="A1A0F31E"/>
@@ -8204,7 +8854,120 @@
       </w:rPr>
     </w:lvl>
   </w:abstractNum>
-  <w:abstractNum w:abstractNumId="8" w15:restartNumberingAfterBreak="0">
+  <w:abstractNum w:abstractNumId="10" w15:restartNumberingAfterBreak="0">
+    <w:nsid w:val="3B4A4A24"/>
+    <w:multiLevelType w:val="hybridMultilevel"/>
+    <w:tmpl w:val="F17EED6A"/>
+    <w:lvl w:ilvl="0" w:tplc="40090001">
+      <w:start w:val="1"/>
+      <w:numFmt w:val="bullet"/>
+      <w:lvlText w:val=""/>
+      <w:lvlJc w:val="left"/>
+      <w:pPr>
+        <w:ind w:left="720" w:hanging="360"/>
+      </w:pPr>
+      <w:rPr>
+        <w:rFonts w:ascii="Symbol" w:hAnsi="Symbol" w:hint="default"/>
+      </w:rPr>
+    </w:lvl>
+    <w:lvl w:ilvl="1" w:tplc="40090003" w:tentative="1">
+      <w:start w:val="1"/>
+      <w:numFmt w:val="bullet"/>
+      <w:lvlText w:val="o"/>
+      <w:lvlJc w:val="left"/>
+      <w:pPr>
+        <w:ind w:left="1440" w:hanging="360"/>
+      </w:pPr>
+      <w:rPr>
+        <w:rFonts w:ascii="Courier New" w:hAnsi="Courier New" w:cs="Courier New" w:hint="default"/>
+      </w:rPr>
+    </w:lvl>
+    <w:lvl w:ilvl="2" w:tplc="40090005" w:tentative="1">
+      <w:start w:val="1"/>
+      <w:numFmt w:val="bullet"/>
+      <w:lvlText w:val=""/>
+      <w:lvlJc w:val="left"/>
+      <w:pPr>
+        <w:ind w:left="2160" w:hanging="360"/>
+      </w:pPr>
+      <w:rPr>
+        <w:rFonts w:ascii="Wingdings" w:hAnsi="Wingdings" w:hint="default"/>
+      </w:rPr>
+    </w:lvl>
+    <w:lvl w:ilvl="3" w:tplc="40090001" w:tentative="1">
+      <w:start w:val="1"/>
+      <w:numFmt w:val="bullet"/>
+      <w:lvlText w:val=""/>
+      <w:lvlJc w:val="left"/>
+      <w:pPr>
+        <w:ind w:left="2880" w:hanging="360"/>
+      </w:pPr>
+      <w:rPr>
+        <w:rFonts w:ascii="Symbol" w:hAnsi="Symbol" w:hint="default"/>
+      </w:rPr>
+    </w:lvl>
+    <w:lvl w:ilvl="4" w:tplc="40090003" w:tentative="1">
+      <w:start w:val="1"/>
+      <w:numFmt w:val="bullet"/>
+      <w:lvlText w:val="o"/>
+      <w:lvlJc w:val="left"/>
+      <w:pPr>
+        <w:ind w:left="3600" w:hanging="360"/>
+      </w:pPr>
+      <w:rPr>
+        <w:rFonts w:ascii="Courier New" w:hAnsi="Courier New" w:cs="Courier New" w:hint="default"/>
+      </w:rPr>
+    </w:lvl>
+    <w:lvl w:ilvl="5" w:tplc="40090005" w:tentative="1">
+      <w:start w:val="1"/>
+      <w:numFmt w:val="bullet"/>
+      <w:lvlText w:val=""/>
+      <w:lvlJc w:val="left"/>
+      <w:pPr>
+        <w:ind w:left="4320" w:hanging="360"/>
+      </w:pPr>
+      <w:rPr>
+        <w:rFonts w:ascii="Wingdings" w:hAnsi="Wingdings" w:hint="default"/>
+      </w:rPr>
+    </w:lvl>
+    <w:lvl w:ilvl="6" w:tplc="40090001" w:tentative="1">
+      <w:start w:val="1"/>
+      <w:numFmt w:val="bullet"/>
+      <w:lvlText w:val=""/>
+      <w:lvlJc w:val="left"/>
+      <w:pPr>
+        <w:ind w:left="5040" w:hanging="360"/>
+      </w:pPr>
+      <w:rPr>
+        <w:rFonts w:ascii="Symbol" w:hAnsi="Symbol" w:hint="default"/>
+      </w:rPr>
+    </w:lvl>
+    <w:lvl w:ilvl="7" w:tplc="40090003" w:tentative="1">
+      <w:start w:val="1"/>
+      <w:numFmt w:val="bullet"/>
+      <w:lvlText w:val="o"/>
+      <w:lvlJc w:val="left"/>
+      <w:pPr>
+        <w:ind w:left="5760" w:hanging="360"/>
+      </w:pPr>
+      <w:rPr>
+        <w:rFonts w:ascii="Courier New" w:hAnsi="Courier New" w:cs="Courier New" w:hint="default"/>
+      </w:rPr>
+    </w:lvl>
+    <w:lvl w:ilvl="8" w:tplc="40090005" w:tentative="1">
+      <w:start w:val="1"/>
+      <w:numFmt w:val="bullet"/>
+      <w:lvlText w:val=""/>
+      <w:lvlJc w:val="left"/>
+      <w:pPr>
+        <w:ind w:left="6480" w:hanging="360"/>
+      </w:pPr>
+      <w:rPr>
+        <w:rFonts w:ascii="Wingdings" w:hAnsi="Wingdings" w:hint="default"/>
+      </w:rPr>
+    </w:lvl>
+  </w:abstractNum>
+  <w:abstractNum w:abstractNumId="11" w15:restartNumberingAfterBreak="0">
     <w:nsid w:val="41B27BC7"/>
     <w:multiLevelType w:val="hybridMultilevel"/>
     <w:tmpl w:val="FADEC5E0"/>
@@ -8317,7 +9080,7 @@
       </w:rPr>
     </w:lvl>
   </w:abstractNum>
-  <w:abstractNum w:abstractNumId="9" w15:restartNumberingAfterBreak="0">
+  <w:abstractNum w:abstractNumId="12" w15:restartNumberingAfterBreak="0">
     <w:nsid w:val="43460680"/>
     <w:multiLevelType w:val="hybridMultilevel"/>
     <w:tmpl w:val="26726C2C"/>
@@ -8430,7 +9193,7 @@
       </w:rPr>
     </w:lvl>
   </w:abstractNum>
-  <w:abstractNum w:abstractNumId="10" w15:restartNumberingAfterBreak="0">
+  <w:abstractNum w:abstractNumId="13" w15:restartNumberingAfterBreak="0">
     <w:nsid w:val="478E4EDE"/>
     <w:multiLevelType w:val="hybridMultilevel"/>
     <w:tmpl w:val="E244D8C4"/>
@@ -8543,7 +9306,7 @@
       </w:rPr>
     </w:lvl>
   </w:abstractNum>
-  <w:abstractNum w:abstractNumId="11" w15:restartNumberingAfterBreak="0">
+  <w:abstractNum w:abstractNumId="14" w15:restartNumberingAfterBreak="0">
     <w:nsid w:val="4B9A24BB"/>
     <w:multiLevelType w:val="hybridMultilevel"/>
     <w:tmpl w:val="FEB62214"/>
@@ -8656,7 +9419,7 @@
       </w:rPr>
     </w:lvl>
   </w:abstractNum>
-  <w:abstractNum w:abstractNumId="12" w15:restartNumberingAfterBreak="0">
+  <w:abstractNum w:abstractNumId="15" w15:restartNumberingAfterBreak="0">
     <w:nsid w:val="6958141B"/>
     <w:multiLevelType w:val="hybridMultilevel"/>
     <w:tmpl w:val="02B65B1E"/>
@@ -8769,7 +9532,7 @@
       </w:rPr>
     </w:lvl>
   </w:abstractNum>
-  <w:abstractNum w:abstractNumId="13" w15:restartNumberingAfterBreak="0">
+  <w:abstractNum w:abstractNumId="16" w15:restartNumberingAfterBreak="0">
     <w:nsid w:val="6B100D9E"/>
     <w:multiLevelType w:val="hybridMultilevel"/>
     <w:tmpl w:val="172A2EC2"/>
@@ -8882,7 +9645,7 @@
       </w:rPr>
     </w:lvl>
   </w:abstractNum>
-  <w:abstractNum w:abstractNumId="14" w15:restartNumberingAfterBreak="0">
+  <w:abstractNum w:abstractNumId="17" w15:restartNumberingAfterBreak="0">
     <w:nsid w:val="6F52624E"/>
     <w:multiLevelType w:val="hybridMultilevel"/>
     <w:tmpl w:val="E97859D0"/>
@@ -8995,7 +9758,7 @@
       </w:rPr>
     </w:lvl>
   </w:abstractNum>
-  <w:abstractNum w:abstractNumId="15" w15:restartNumberingAfterBreak="0">
+  <w:abstractNum w:abstractNumId="18" w15:restartNumberingAfterBreak="0">
     <w:nsid w:val="781D4FEB"/>
     <w:multiLevelType w:val="hybridMultilevel"/>
     <w:tmpl w:val="450A1A9A"/>
@@ -9108,7 +9871,7 @@
       </w:rPr>
     </w:lvl>
   </w:abstractNum>
-  <w:abstractNum w:abstractNumId="16" w15:restartNumberingAfterBreak="0">
+  <w:abstractNum w:abstractNumId="19" w15:restartNumberingAfterBreak="0">
     <w:nsid w:val="7C8839B4"/>
     <w:multiLevelType w:val="hybridMultilevel"/>
     <w:tmpl w:val="BE043446"/>
@@ -9221,7 +9984,7 @@
       </w:rPr>
     </w:lvl>
   </w:abstractNum>
-  <w:abstractNum w:abstractNumId="17" w15:restartNumberingAfterBreak="0">
+  <w:abstractNum w:abstractNumId="20" w15:restartNumberingAfterBreak="0">
     <w:nsid w:val="7D282EC7"/>
     <w:multiLevelType w:val="hybridMultilevel"/>
     <w:tmpl w:val="6B228DE0"/>
@@ -9334,7 +10097,7 @@
       </w:rPr>
     </w:lvl>
   </w:abstractNum>
-  <w:abstractNum w:abstractNumId="18" w15:restartNumberingAfterBreak="0">
+  <w:abstractNum w:abstractNumId="21" w15:restartNumberingAfterBreak="0">
     <w:nsid w:val="7EC5182E"/>
     <w:multiLevelType w:val="hybridMultilevel"/>
     <w:tmpl w:val="2550DE50"/>
@@ -9448,61 +10211,70 @@
     </w:lvl>
   </w:abstractNum>
   <w:num w:numId="1" w16cid:durableId="1518154062">
+    <w:abstractNumId w:val="5"/>
+  </w:num>
+  <w:num w:numId="2" w16cid:durableId="1698003925">
+    <w:abstractNumId w:val="16"/>
+  </w:num>
+  <w:num w:numId="3" w16cid:durableId="335811534">
+    <w:abstractNumId w:val="17"/>
+  </w:num>
+  <w:num w:numId="4" w16cid:durableId="2080252002">
+    <w:abstractNumId w:val="18"/>
+  </w:num>
+  <w:num w:numId="5" w16cid:durableId="93210796">
+    <w:abstractNumId w:val="11"/>
+  </w:num>
+  <w:num w:numId="6" w16cid:durableId="850416099">
+    <w:abstractNumId w:val="13"/>
+  </w:num>
+  <w:num w:numId="7" w16cid:durableId="1813711206">
+    <w:abstractNumId w:val="9"/>
+  </w:num>
+  <w:num w:numId="8" w16cid:durableId="1692147640">
+    <w:abstractNumId w:val="20"/>
+  </w:num>
+  <w:num w:numId="9" w16cid:durableId="920260448">
+    <w:abstractNumId w:val="2"/>
+  </w:num>
+  <w:num w:numId="10" w16cid:durableId="672102760">
+    <w:abstractNumId w:val="14"/>
+  </w:num>
+  <w:num w:numId="11" w16cid:durableId="288244586">
+    <w:abstractNumId w:val="3"/>
+  </w:num>
+  <w:num w:numId="12" w16cid:durableId="1046829020">
+    <w:abstractNumId w:val="15"/>
+  </w:num>
+  <w:num w:numId="13" w16cid:durableId="2074887576">
+    <w:abstractNumId w:val="8"/>
+  </w:num>
+  <w:num w:numId="14" w16cid:durableId="642777807">
+    <w:abstractNumId w:val="19"/>
+  </w:num>
+  <w:num w:numId="15" w16cid:durableId="1168441650">
+    <w:abstractNumId w:val="1"/>
+  </w:num>
+  <w:num w:numId="16" w16cid:durableId="204682154">
+    <w:abstractNumId w:val="12"/>
+  </w:num>
+  <w:num w:numId="17" w16cid:durableId="2138642739">
+    <w:abstractNumId w:val="21"/>
+  </w:num>
+  <w:num w:numId="18" w16cid:durableId="730271878">
+    <w:abstractNumId w:val="6"/>
+  </w:num>
+  <w:num w:numId="19" w16cid:durableId="13116454">
     <w:abstractNumId w:val="4"/>
   </w:num>
-  <w:num w:numId="2" w16cid:durableId="1698003925">
-    <w:abstractNumId w:val="13"/>
-  </w:num>
-  <w:num w:numId="3" w16cid:durableId="335811534">
-    <w:abstractNumId w:val="14"/>
-  </w:num>
-  <w:num w:numId="4" w16cid:durableId="2080252002">
-    <w:abstractNumId w:val="15"/>
-  </w:num>
-  <w:num w:numId="5" w16cid:durableId="93210796">
-    <w:abstractNumId w:val="8"/>
-  </w:num>
-  <w:num w:numId="6" w16cid:durableId="850416099">
+  <w:num w:numId="20" w16cid:durableId="986663731">
     <w:abstractNumId w:val="10"/>
   </w:num>
-  <w:num w:numId="7" w16cid:durableId="1813711206">
+  <w:num w:numId="21" w16cid:durableId="1237663541">
     <w:abstractNumId w:val="7"/>
   </w:num>
-  <w:num w:numId="8" w16cid:durableId="1692147640">
-    <w:abstractNumId w:val="17"/>
-  </w:num>
-  <w:num w:numId="9" w16cid:durableId="920260448">
-    <w:abstractNumId w:val="1"/>
-  </w:num>
-  <w:num w:numId="10" w16cid:durableId="672102760">
-    <w:abstractNumId w:val="11"/>
-  </w:num>
-  <w:num w:numId="11" w16cid:durableId="288244586">
-    <w:abstractNumId w:val="2"/>
-  </w:num>
-  <w:num w:numId="12" w16cid:durableId="1046829020">
-    <w:abstractNumId w:val="12"/>
-  </w:num>
-  <w:num w:numId="13" w16cid:durableId="2074887576">
-    <w:abstractNumId w:val="6"/>
-  </w:num>
-  <w:num w:numId="14" w16cid:durableId="642777807">
-    <w:abstractNumId w:val="16"/>
-  </w:num>
-  <w:num w:numId="15" w16cid:durableId="1168441650">
+  <w:num w:numId="22" w16cid:durableId="365913184">
     <w:abstractNumId w:val="0"/>
-  </w:num>
-  <w:num w:numId="16" w16cid:durableId="204682154">
-    <w:abstractNumId w:val="9"/>
-  </w:num>
-  <w:num w:numId="17" w16cid:durableId="2138642739">
-    <w:abstractNumId w:val="18"/>
-  </w:num>
-  <w:num w:numId="18" w16cid:durableId="730271878">
-    <w:abstractNumId w:val="5"/>
-  </w:num>
-  <w:num w:numId="19" w16cid:durableId="13116454">
-    <w:abstractNumId w:val="3"/>
   </w:num>
 </w:numbering>
 </file>
@@ -10110,6 +10882,7 @@
   <w:style w:type="character" w:default="1" w:styleId="DefaultParagraphFont">
     <w:name w:val="Default Paragraph Font"/>
     <w:uiPriority w:val="1"/>
+    <w:semiHidden/>
     <w:unhideWhenUsed/>
   </w:style>
   <w:style w:type="table" w:default="1" w:styleId="TableNormal">

</xml_diff>